<commit_message>
Proposal: remove commercials, team/references, payment and paid-trial wording
Co-Authored-By: Claude Opus 5.5 <noreply@anthropic.com>
</commit_message>
<xml_diff>
--- a/docs/SY-OS-Phase1-Proposal.docx
+++ b/docs/SY-OS-Phase1-Proposal.docx
@@ -383,7 +383,7 @@
                 <w:sz w:val="19"/>
                 <w:szCs w:val="19"/>
               </w:rPr>
-              <w:t xml:space="preserve">Draft for discussion — pricing to follow after the floor walkthrough</w:t>
+              <w:t xml:space="preserve">Draft for discussion</w:t>
             </w:r>
           </w:p>
         </w:tc>
@@ -4160,34 +4160,6 @@
       </w:tr>
     </w:tbl>
     <w:p>
-      <w:pPr>
-        <w:spacing w:after="120" w:line="300"/>
-      </w:pPr>
-      <w:r>
-        <w:rPr>
-          <w:rFonts w:ascii="Arial" w:cs="Arial" w:eastAsia="Arial" w:hAnsi="Arial"/>
-          <w:b/>
-          <w:bCs/>
-        </w:rPr>
-        <w:t xml:space="preserve">Indicative cost to add barcode scanning and scales after Phase 1: </w:t>
-      </w:r>
-      <w:r>
-        <w:rPr>
-          <w:rFonts w:ascii="Arial" w:cs="Arial" w:eastAsia="Arial" w:hAnsi="Arial"/>
-          <w:b/>
-          <w:bCs/>
-          <w:highlight w:val="yellow"/>
-        </w:rPr>
-        <w:t xml:space="preserve">[to be quoted]</w:t>
-      </w:r>
-      <w:r>
-        <w:rPr>
-          <w:rFonts w:ascii="Arial" w:cs="Arial" w:eastAsia="Arial" w:hAnsi="Arial"/>
-        </w:rPr>
-        <w:t xml:space="preserve"> (software only; hardware bought by you).</w:t>
-      </w:r>
-    </w:p>
-    <w:p>
       <w:r>
         <w:br w:type="page"/>
       </w:r>
@@ -4455,7 +4427,7 @@
                 <w:sz w:val="19"/>
                 <w:szCs w:val="19"/>
               </w:rPr>
-              <w:t xml:space="preserve">1 · Trial (paid)</w:t>
+              <w:t xml:space="preserve">1 · Trial</w:t>
             </w:r>
           </w:p>
         </w:tc>
@@ -5132,7 +5104,7 @@
         <w:rPr>
           <w:rFonts w:ascii="Arial" w:cs="Arial" w:eastAsia="Arial" w:hAnsi="Arial"/>
         </w:rPr>
-        <w:t xml:space="preserve">9. Questions before we price</w:t>
+        <w:t xml:space="preserve">9. Questions before we start</w:t>
       </w:r>
     </w:p>
     <w:p>
@@ -5143,7 +5115,7 @@
         <w:rPr>
           <w:rFonts w:ascii="Arial" w:cs="Arial" w:eastAsia="Arial" w:hAnsi="Arial"/>
         </w:rPr>
-        <w:t xml:space="preserve">These change the size of the work, so we would like answers — or a floor walkthrough — before giving a fixed price.</w:t>
+        <w:t xml:space="preserve">These change the size of the work, so we would like answers — or a floor walkthrough — before we start building.</w:t>
       </w:r>
     </w:p>
     <w:p>
@@ -5394,1275 +5366,7 @@
         <w:rPr>
           <w:rFonts w:ascii="Arial" w:cs="Arial" w:eastAsia="Arial" w:hAnsi="Arial"/>
         </w:rPr>
-        <w:t xml:space="preserve">10. Commercials</w:t>
-      </w:r>
-    </w:p>
-    <w:p>
-      <w:pPr>
-        <w:spacing w:after="120" w:line="300"/>
-      </w:pPr>
-      <w:r>
-        <w:rPr>
-          <w:rFonts w:ascii="Arial" w:cs="Arial" w:eastAsia="Arial" w:hAnsi="Arial"/>
-        </w:rPr>
-        <w:t xml:space="preserve">Fixed price per milestone, paid on acceptance on your floor, as your brief proposes.</w:t>
-      </w:r>
-    </w:p>
-    <w:tbl>
-      <w:tblPr>
-        <w:tblW w:type="dxa" w:w="9638"/>
-        <w:tblBorders>
-          <w:top w:val="single" w:color="auto" w:sz="4"/>
-          <w:left w:val="single" w:color="auto" w:sz="4"/>
-          <w:bottom w:val="single" w:color="auto" w:sz="4"/>
-          <w:right w:val="single" w:color="auto" w:sz="4"/>
-          <w:insideH w:val="single" w:color="auto" w:sz="4"/>
-          <w:insideV w:val="single" w:color="auto" w:sz="4"/>
-        </w:tblBorders>
-      </w:tblPr>
-      <w:tblGrid>
-        <w:gridCol w:w="3600"/>
-        <w:gridCol w:w="3000"/>
-        <w:gridCol w:w="3038"/>
-      </w:tblGrid>
-      <w:tr>
-        <w:trPr>
-          <w:tblHeader/>
-        </w:trPr>
-        <w:tc>
-          <w:tcPr>
-            <w:tcW w:type="dxa" w:w="3600"/>
-            <w:tcBorders>
-              <w:top w:val="single" w:color="E5E5E5" w:sz="4"/>
-              <w:left w:val="single" w:color="E5E5E5" w:sz="4"/>
-              <w:bottom w:val="single" w:color="E5E5E5" w:sz="4"/>
-              <w:right w:val="single" w:color="E5E5E5" w:sz="4"/>
-            </w:tcBorders>
-            <w:shd w:fill="F5F5F5" w:color="auto" w:val="clear"/>
-            <w:tcMar>
-              <w:top w:type="dxa" w:w="70"/>
-              <w:left w:type="dxa" w:w="110"/>
-              <w:bottom w:type="dxa" w:w="70"/>
-              <w:right w:type="dxa" w:w="110"/>
-            </w:tcMar>
-          </w:tcPr>
-          <w:p>
-            <w:pPr>
-              <w:spacing w:after="0" w:line="270"/>
-            </w:pPr>
-            <w:r>
-              <w:rPr>
-                <w:rFonts w:ascii="Arial" w:cs="Arial" w:eastAsia="Arial" w:hAnsi="Arial"/>
-                <w:b/>
-                <w:bCs/>
-                <w:color w:val="737373"/>
-                <w:sz w:val="18"/>
-                <w:szCs w:val="18"/>
-              </w:rPr>
-              <w:t xml:space="preserve">Item</w:t>
-            </w:r>
-          </w:p>
-        </w:tc>
-        <w:tc>
-          <w:tcPr>
-            <w:tcW w:type="dxa" w:w="3000"/>
-            <w:tcBorders>
-              <w:top w:val="single" w:color="E5E5E5" w:sz="4"/>
-              <w:left w:val="single" w:color="E5E5E5" w:sz="4"/>
-              <w:bottom w:val="single" w:color="E5E5E5" w:sz="4"/>
-              <w:right w:val="single" w:color="E5E5E5" w:sz="4"/>
-            </w:tcBorders>
-            <w:shd w:fill="F5F5F5" w:color="auto" w:val="clear"/>
-            <w:tcMar>
-              <w:top w:type="dxa" w:w="70"/>
-              <w:left w:type="dxa" w:w="110"/>
-              <w:bottom w:type="dxa" w:w="70"/>
-              <w:right w:type="dxa" w:w="110"/>
-            </w:tcMar>
-          </w:tcPr>
-          <w:p>
-            <w:pPr>
-              <w:spacing w:after="0" w:line="270"/>
-            </w:pPr>
-            <w:r>
-              <w:rPr>
-                <w:rFonts w:ascii="Arial" w:cs="Arial" w:eastAsia="Arial" w:hAnsi="Arial"/>
-                <w:b/>
-                <w:bCs/>
-                <w:color w:val="737373"/>
-                <w:sz w:val="18"/>
-                <w:szCs w:val="18"/>
-              </w:rPr>
-              <w:t xml:space="preserve">Price (₹)</w:t>
-            </w:r>
-          </w:p>
-        </w:tc>
-        <w:tc>
-          <w:tcPr>
-            <w:tcW w:type="dxa" w:w="3038"/>
-            <w:tcBorders>
-              <w:top w:val="single" w:color="E5E5E5" w:sz="4"/>
-              <w:left w:val="single" w:color="E5E5E5" w:sz="4"/>
-              <w:bottom w:val="single" w:color="E5E5E5" w:sz="4"/>
-              <w:right w:val="single" w:color="E5E5E5" w:sz="4"/>
-            </w:tcBorders>
-            <w:shd w:fill="F5F5F5" w:color="auto" w:val="clear"/>
-            <w:tcMar>
-              <w:top w:type="dxa" w:w="70"/>
-              <w:left w:type="dxa" w:w="110"/>
-              <w:bottom w:type="dxa" w:w="70"/>
-              <w:right w:type="dxa" w:w="110"/>
-            </w:tcMar>
-          </w:tcPr>
-          <w:p>
-            <w:pPr>
-              <w:spacing w:after="0" w:line="270"/>
-            </w:pPr>
-            <w:r>
-              <w:rPr>
-                <w:rFonts w:ascii="Arial" w:cs="Arial" w:eastAsia="Arial" w:hAnsi="Arial"/>
-                <w:b/>
-                <w:bCs/>
-                <w:color w:val="737373"/>
-                <w:sz w:val="18"/>
-                <w:szCs w:val="18"/>
-              </w:rPr>
-              <w:t xml:space="preserve">Notes</w:t>
-            </w:r>
-          </w:p>
-        </w:tc>
-      </w:tr>
-      <w:tr>
-        <w:trPr>
-          <w:tblHeader w:val="off"/>
-        </w:trPr>
-        <w:tc>
-          <w:tcPr>
-            <w:tcW w:type="dxa" w:w="3600"/>
-            <w:tcBorders>
-              <w:top w:val="single" w:color="E5E5E5" w:sz="4"/>
-              <w:left w:val="single" w:color="E5E5E5" w:sz="4"/>
-              <w:bottom w:val="single" w:color="E5E5E5" w:sz="4"/>
-              <w:right w:val="single" w:color="E5E5E5" w:sz="4"/>
-            </w:tcBorders>
-            <w:tcMar>
-              <w:top w:type="dxa" w:w="70"/>
-              <w:left w:type="dxa" w:w="110"/>
-              <w:bottom w:type="dxa" w:w="70"/>
-              <w:right w:type="dxa" w:w="110"/>
-            </w:tcMar>
-          </w:tcPr>
-          <w:p>
-            <w:pPr>
-              <w:spacing w:after="0" w:line="270"/>
-            </w:pPr>
-            <w:r>
-              <w:rPr>
-                <w:rFonts w:ascii="Arial" w:cs="Arial" w:eastAsia="Arial" w:hAnsi="Arial"/>
-                <w:sz w:val="19"/>
-                <w:szCs w:val="19"/>
-              </w:rPr>
-              <w:t xml:space="preserve">1 · Trial — master order + fabric planning</w:t>
-            </w:r>
-          </w:p>
-        </w:tc>
-        <w:tc>
-          <w:tcPr>
-            <w:tcW w:type="dxa" w:w="3000"/>
-            <w:tcBorders>
-              <w:top w:val="single" w:color="E5E5E5" w:sz="4"/>
-              <w:left w:val="single" w:color="E5E5E5" w:sz="4"/>
-              <w:bottom w:val="single" w:color="E5E5E5" w:sz="4"/>
-              <w:right w:val="single" w:color="E5E5E5" w:sz="4"/>
-            </w:tcBorders>
-            <w:tcMar>
-              <w:top w:type="dxa" w:w="70"/>
-              <w:left w:type="dxa" w:w="110"/>
-              <w:bottom w:type="dxa" w:w="70"/>
-              <w:right w:type="dxa" w:w="110"/>
-            </w:tcMar>
-          </w:tcPr>
-          <w:p>
-            <w:pPr>
-              <w:spacing w:after="0" w:line="270"/>
-            </w:pPr>
-            <w:r>
-              <w:rPr>
-                <w:rFonts w:ascii="Arial" w:cs="Arial" w:eastAsia="Arial" w:hAnsi="Arial"/>
-                <w:sz w:val="19"/>
-                <w:szCs w:val="19"/>
-              </w:rPr>
-              <w:t xml:space="preserve">[to be filled]</w:t>
-            </w:r>
-          </w:p>
-        </w:tc>
-        <w:tc>
-          <w:tcPr>
-            <w:tcW w:type="dxa" w:w="3038"/>
-            <w:tcBorders>
-              <w:top w:val="single" w:color="E5E5E5" w:sz="4"/>
-              <w:left w:val="single" w:color="E5E5E5" w:sz="4"/>
-              <w:bottom w:val="single" w:color="E5E5E5" w:sz="4"/>
-              <w:right w:val="single" w:color="E5E5E5" w:sz="4"/>
-            </w:tcBorders>
-            <w:tcMar>
-              <w:top w:type="dxa" w:w="70"/>
-              <w:left w:type="dxa" w:w="110"/>
-              <w:bottom w:type="dxa" w:w="70"/>
-              <w:right w:type="dxa" w:w="110"/>
-            </w:tcMar>
-          </w:tcPr>
-          <w:p>
-            <w:pPr>
-              <w:spacing w:after="0" w:line="270"/>
-            </w:pPr>
-            <w:r>
-              <w:rPr>
-                <w:rFonts w:ascii="Arial" w:cs="Arial" w:eastAsia="Arial" w:hAnsi="Arial"/>
-                <w:sz w:val="19"/>
-                <w:szCs w:val="19"/>
-              </w:rPr>
-              <w:t xml:space="preserve">Paid trial; you decide after it whether to continue</w:t>
-            </w:r>
-          </w:p>
-        </w:tc>
-      </w:tr>
-      <w:tr>
-        <w:trPr>
-          <w:tblHeader w:val="off"/>
-        </w:trPr>
-        <w:tc>
-          <w:tcPr>
-            <w:tcW w:type="dxa" w:w="3600"/>
-            <w:tcBorders>
-              <w:top w:val="single" w:color="E5E5E5" w:sz="4"/>
-              <w:left w:val="single" w:color="E5E5E5" w:sz="4"/>
-              <w:bottom w:val="single" w:color="E5E5E5" w:sz="4"/>
-              <w:right w:val="single" w:color="E5E5E5" w:sz="4"/>
-            </w:tcBorders>
-            <w:tcMar>
-              <w:top w:type="dxa" w:w="70"/>
-              <w:left w:type="dxa" w:w="110"/>
-              <w:bottom w:type="dxa" w:w="70"/>
-              <w:right w:type="dxa" w:w="110"/>
-            </w:tcMar>
-          </w:tcPr>
-          <w:p>
-            <w:pPr>
-              <w:spacing w:after="0" w:line="270"/>
-            </w:pPr>
-            <w:r>
-              <w:rPr>
-                <w:rFonts w:ascii="Arial" w:cs="Arial" w:eastAsia="Arial" w:hAnsi="Arial"/>
-                <w:sz w:val="19"/>
-                <w:szCs w:val="19"/>
-              </w:rPr>
-              <w:t xml:space="preserve">2 · Inward &amp; trims</w:t>
-            </w:r>
-          </w:p>
-        </w:tc>
-        <w:tc>
-          <w:tcPr>
-            <w:tcW w:type="dxa" w:w="3000"/>
-            <w:tcBorders>
-              <w:top w:val="single" w:color="E5E5E5" w:sz="4"/>
-              <w:left w:val="single" w:color="E5E5E5" w:sz="4"/>
-              <w:bottom w:val="single" w:color="E5E5E5" w:sz="4"/>
-              <w:right w:val="single" w:color="E5E5E5" w:sz="4"/>
-            </w:tcBorders>
-            <w:tcMar>
-              <w:top w:type="dxa" w:w="70"/>
-              <w:left w:type="dxa" w:w="110"/>
-              <w:bottom w:type="dxa" w:w="70"/>
-              <w:right w:type="dxa" w:w="110"/>
-            </w:tcMar>
-          </w:tcPr>
-          <w:p>
-            <w:pPr>
-              <w:spacing w:after="0" w:line="270"/>
-            </w:pPr>
-            <w:r>
-              <w:rPr>
-                <w:rFonts w:ascii="Arial" w:cs="Arial" w:eastAsia="Arial" w:hAnsi="Arial"/>
-                <w:sz w:val="19"/>
-                <w:szCs w:val="19"/>
-              </w:rPr>
-              <w:t xml:space="preserve">[to be filled]</w:t>
-            </w:r>
-          </w:p>
-        </w:tc>
-        <w:tc>
-          <w:tcPr>
-            <w:tcW w:type="dxa" w:w="3038"/>
-            <w:tcBorders>
-              <w:top w:val="single" w:color="E5E5E5" w:sz="4"/>
-              <w:left w:val="single" w:color="E5E5E5" w:sz="4"/>
-              <w:bottom w:val="single" w:color="E5E5E5" w:sz="4"/>
-              <w:right w:val="single" w:color="E5E5E5" w:sz="4"/>
-            </w:tcBorders>
-            <w:tcMar>
-              <w:top w:type="dxa" w:w="70"/>
-              <w:left w:type="dxa" w:w="110"/>
-              <w:bottom w:type="dxa" w:w="70"/>
-              <w:right w:type="dxa" w:w="110"/>
-            </w:tcMar>
-          </w:tcPr>
-          <w:p>
-            <w:pPr>
-              <w:spacing w:after="0" w:line="270"/>
-            </w:pPr>
-            <w:r>
-              <w:rPr>
-                <w:rFonts w:ascii="Arial" w:cs="Arial" w:eastAsia="Arial" w:hAnsi="Arial"/>
-                <w:sz w:val="19"/>
-                <w:szCs w:val="19"/>
-              </w:rPr>
-              <w:t xml:space="preserve"/>
-            </w:r>
-          </w:p>
-        </w:tc>
-      </w:tr>
-      <w:tr>
-        <w:trPr>
-          <w:tblHeader w:val="off"/>
-        </w:trPr>
-        <w:tc>
-          <w:tcPr>
-            <w:tcW w:type="dxa" w:w="3600"/>
-            <w:tcBorders>
-              <w:top w:val="single" w:color="E5E5E5" w:sz="4"/>
-              <w:left w:val="single" w:color="E5E5E5" w:sz="4"/>
-              <w:bottom w:val="single" w:color="E5E5E5" w:sz="4"/>
-              <w:right w:val="single" w:color="E5E5E5" w:sz="4"/>
-            </w:tcBorders>
-            <w:tcMar>
-              <w:top w:type="dxa" w:w="70"/>
-              <w:left w:type="dxa" w:w="110"/>
-              <w:bottom w:type="dxa" w:w="70"/>
-              <w:right w:type="dxa" w:w="110"/>
-            </w:tcMar>
-          </w:tcPr>
-          <w:p>
-            <w:pPr>
-              <w:spacing w:after="0" w:line="270"/>
-            </w:pPr>
-            <w:r>
-              <w:rPr>
-                <w:rFonts w:ascii="Arial" w:cs="Arial" w:eastAsia="Arial" w:hAnsi="Arial"/>
-                <w:sz w:val="19"/>
-                <w:szCs w:val="19"/>
-              </w:rPr>
-              <w:t xml:space="preserve">3 · Cutting</w:t>
-            </w:r>
-          </w:p>
-        </w:tc>
-        <w:tc>
-          <w:tcPr>
-            <w:tcW w:type="dxa" w:w="3000"/>
-            <w:tcBorders>
-              <w:top w:val="single" w:color="E5E5E5" w:sz="4"/>
-              <w:left w:val="single" w:color="E5E5E5" w:sz="4"/>
-              <w:bottom w:val="single" w:color="E5E5E5" w:sz="4"/>
-              <w:right w:val="single" w:color="E5E5E5" w:sz="4"/>
-            </w:tcBorders>
-            <w:tcMar>
-              <w:top w:type="dxa" w:w="70"/>
-              <w:left w:type="dxa" w:w="110"/>
-              <w:bottom w:type="dxa" w:w="70"/>
-              <w:right w:type="dxa" w:w="110"/>
-            </w:tcMar>
-          </w:tcPr>
-          <w:p>
-            <w:pPr>
-              <w:spacing w:after="0" w:line="270"/>
-            </w:pPr>
-            <w:r>
-              <w:rPr>
-                <w:rFonts w:ascii="Arial" w:cs="Arial" w:eastAsia="Arial" w:hAnsi="Arial"/>
-                <w:sz w:val="19"/>
-                <w:szCs w:val="19"/>
-              </w:rPr>
-              <w:t xml:space="preserve">[to be filled]</w:t>
-            </w:r>
-          </w:p>
-        </w:tc>
-        <w:tc>
-          <w:tcPr>
-            <w:tcW w:type="dxa" w:w="3038"/>
-            <w:tcBorders>
-              <w:top w:val="single" w:color="E5E5E5" w:sz="4"/>
-              <w:left w:val="single" w:color="E5E5E5" w:sz="4"/>
-              <w:bottom w:val="single" w:color="E5E5E5" w:sz="4"/>
-              <w:right w:val="single" w:color="E5E5E5" w:sz="4"/>
-            </w:tcBorders>
-            <w:tcMar>
-              <w:top w:type="dxa" w:w="70"/>
-              <w:left w:type="dxa" w:w="110"/>
-              <w:bottom w:type="dxa" w:w="70"/>
-              <w:right w:type="dxa" w:w="110"/>
-            </w:tcMar>
-          </w:tcPr>
-          <w:p>
-            <w:pPr>
-              <w:spacing w:after="0" w:line="270"/>
-            </w:pPr>
-            <w:r>
-              <w:rPr>
-                <w:rFonts w:ascii="Arial" w:cs="Arial" w:eastAsia="Arial" w:hAnsi="Arial"/>
-                <w:sz w:val="19"/>
-                <w:szCs w:val="19"/>
-              </w:rPr>
-              <w:t xml:space="preserve"/>
-            </w:r>
-          </w:p>
-        </w:tc>
-      </w:tr>
-      <w:tr>
-        <w:trPr>
-          <w:tblHeader w:val="off"/>
-        </w:trPr>
-        <w:tc>
-          <w:tcPr>
-            <w:tcW w:type="dxa" w:w="3600"/>
-            <w:tcBorders>
-              <w:top w:val="single" w:color="E5E5E5" w:sz="4"/>
-              <w:left w:val="single" w:color="E5E5E5" w:sz="4"/>
-              <w:bottom w:val="single" w:color="E5E5E5" w:sz="4"/>
-              <w:right w:val="single" w:color="E5E5E5" w:sz="4"/>
-            </w:tcBorders>
-            <w:tcMar>
-              <w:top w:type="dxa" w:w="70"/>
-              <w:left w:type="dxa" w:w="110"/>
-              <w:bottom w:type="dxa" w:w="70"/>
-              <w:right w:type="dxa" w:w="110"/>
-            </w:tcMar>
-          </w:tcPr>
-          <w:p>
-            <w:pPr>
-              <w:spacing w:after="0" w:line="270"/>
-            </w:pPr>
-            <w:r>
-              <w:rPr>
-                <w:rFonts w:ascii="Arial" w:cs="Arial" w:eastAsia="Arial" w:hAnsi="Arial"/>
-                <w:sz w:val="19"/>
-                <w:szCs w:val="19"/>
-              </w:rPr>
-              <w:t xml:space="preserve">4 · Floor &amp; go-live</w:t>
-            </w:r>
-          </w:p>
-        </w:tc>
-        <w:tc>
-          <w:tcPr>
-            <w:tcW w:type="dxa" w:w="3000"/>
-            <w:tcBorders>
-              <w:top w:val="single" w:color="E5E5E5" w:sz="4"/>
-              <w:left w:val="single" w:color="E5E5E5" w:sz="4"/>
-              <w:bottom w:val="single" w:color="E5E5E5" w:sz="4"/>
-              <w:right w:val="single" w:color="E5E5E5" w:sz="4"/>
-            </w:tcBorders>
-            <w:tcMar>
-              <w:top w:type="dxa" w:w="70"/>
-              <w:left w:type="dxa" w:w="110"/>
-              <w:bottom w:type="dxa" w:w="70"/>
-              <w:right w:type="dxa" w:w="110"/>
-            </w:tcMar>
-          </w:tcPr>
-          <w:p>
-            <w:pPr>
-              <w:spacing w:after="0" w:line="270"/>
-            </w:pPr>
-            <w:r>
-              <w:rPr>
-                <w:rFonts w:ascii="Arial" w:cs="Arial" w:eastAsia="Arial" w:hAnsi="Arial"/>
-                <w:sz w:val="19"/>
-                <w:szCs w:val="19"/>
-              </w:rPr>
-              <w:t xml:space="preserve">[to be filled]</w:t>
-            </w:r>
-          </w:p>
-        </w:tc>
-        <w:tc>
-          <w:tcPr>
-            <w:tcW w:type="dxa" w:w="3038"/>
-            <w:tcBorders>
-              <w:top w:val="single" w:color="E5E5E5" w:sz="4"/>
-              <w:left w:val="single" w:color="E5E5E5" w:sz="4"/>
-              <w:bottom w:val="single" w:color="E5E5E5" w:sz="4"/>
-              <w:right w:val="single" w:color="E5E5E5" w:sz="4"/>
-            </w:tcBorders>
-            <w:tcMar>
-              <w:top w:type="dxa" w:w="70"/>
-              <w:left w:type="dxa" w:w="110"/>
-              <w:bottom w:type="dxa" w:w="70"/>
-              <w:right w:type="dxa" w:w="110"/>
-            </w:tcMar>
-          </w:tcPr>
-          <w:p>
-            <w:pPr>
-              <w:spacing w:after="0" w:line="270"/>
-            </w:pPr>
-            <w:r>
-              <w:rPr>
-                <w:rFonts w:ascii="Arial" w:cs="Arial" w:eastAsia="Arial" w:hAnsi="Arial"/>
-                <w:sz w:val="19"/>
-                <w:szCs w:val="19"/>
-              </w:rPr>
-              <w:t xml:space="preserve">Includes pilot on 2–3 live orders</w:t>
-            </w:r>
-          </w:p>
-        </w:tc>
-      </w:tr>
-      <w:tr>
-        <w:trPr>
-          <w:tblHeader w:val="off"/>
-        </w:trPr>
-        <w:tc>
-          <w:tcPr>
-            <w:tcW w:type="dxa" w:w="3600"/>
-            <w:tcBorders>
-              <w:top w:val="single" w:color="E5E5E5" w:sz="4"/>
-              <w:left w:val="single" w:color="E5E5E5" w:sz="4"/>
-              <w:bottom w:val="single" w:color="E5E5E5" w:sz="4"/>
-              <w:right w:val="single" w:color="E5E5E5" w:sz="4"/>
-            </w:tcBorders>
-            <w:tcMar>
-              <w:top w:type="dxa" w:w="70"/>
-              <w:left w:type="dxa" w:w="110"/>
-              <w:bottom w:type="dxa" w:w="70"/>
-              <w:right w:type="dxa" w:w="110"/>
-            </w:tcMar>
-          </w:tcPr>
-          <w:p>
-            <w:pPr>
-              <w:spacing w:after="0" w:line="270"/>
-            </w:pPr>
-            <w:r>
-              <w:rPr>
-                <w:rFonts w:ascii="Arial" w:cs="Arial" w:eastAsia="Arial" w:hAnsi="Arial"/>
-                <w:sz w:val="19"/>
-                <w:szCs w:val="19"/>
-              </w:rPr>
-              <w:t xml:space="preserve">Total Phase 1</w:t>
-            </w:r>
-          </w:p>
-        </w:tc>
-        <w:tc>
-          <w:tcPr>
-            <w:tcW w:type="dxa" w:w="3000"/>
-            <w:tcBorders>
-              <w:top w:val="single" w:color="E5E5E5" w:sz="4"/>
-              <w:left w:val="single" w:color="E5E5E5" w:sz="4"/>
-              <w:bottom w:val="single" w:color="E5E5E5" w:sz="4"/>
-              <w:right w:val="single" w:color="E5E5E5" w:sz="4"/>
-            </w:tcBorders>
-            <w:tcMar>
-              <w:top w:type="dxa" w:w="70"/>
-              <w:left w:type="dxa" w:w="110"/>
-              <w:bottom w:type="dxa" w:w="70"/>
-              <w:right w:type="dxa" w:w="110"/>
-            </w:tcMar>
-          </w:tcPr>
-          <w:p>
-            <w:pPr>
-              <w:spacing w:after="0" w:line="270"/>
-            </w:pPr>
-            <w:r>
-              <w:rPr>
-                <w:rFonts w:ascii="Arial" w:cs="Arial" w:eastAsia="Arial" w:hAnsi="Arial"/>
-                <w:sz w:val="19"/>
-                <w:szCs w:val="19"/>
-              </w:rPr>
-              <w:t xml:space="preserve">[to be filled]</w:t>
-            </w:r>
-          </w:p>
-        </w:tc>
-        <w:tc>
-          <w:tcPr>
-            <w:tcW w:type="dxa" w:w="3038"/>
-            <w:tcBorders>
-              <w:top w:val="single" w:color="E5E5E5" w:sz="4"/>
-              <w:left w:val="single" w:color="E5E5E5" w:sz="4"/>
-              <w:bottom w:val="single" w:color="E5E5E5" w:sz="4"/>
-              <w:right w:val="single" w:color="E5E5E5" w:sz="4"/>
-            </w:tcBorders>
-            <w:tcMar>
-              <w:top w:type="dxa" w:w="70"/>
-              <w:left w:type="dxa" w:w="110"/>
-              <w:bottom w:type="dxa" w:w="70"/>
-              <w:right w:type="dxa" w:w="110"/>
-            </w:tcMar>
-          </w:tcPr>
-          <w:p>
-            <w:pPr>
-              <w:spacing w:after="0" w:line="270"/>
-            </w:pPr>
-            <w:r>
-              <w:rPr>
-                <w:rFonts w:ascii="Arial" w:cs="Arial" w:eastAsia="Arial" w:hAnsi="Arial"/>
-                <w:sz w:val="19"/>
-                <w:szCs w:val="19"/>
-              </w:rPr>
-              <w:t xml:space="preserve"/>
-            </w:r>
-          </w:p>
-        </w:tc>
-      </w:tr>
-      <w:tr>
-        <w:trPr>
-          <w:tblHeader w:val="off"/>
-        </w:trPr>
-        <w:tc>
-          <w:tcPr>
-            <w:tcW w:type="dxa" w:w="3600"/>
-            <w:tcBorders>
-              <w:top w:val="single" w:color="E5E5E5" w:sz="4"/>
-              <w:left w:val="single" w:color="E5E5E5" w:sz="4"/>
-              <w:bottom w:val="single" w:color="E5E5E5" w:sz="4"/>
-              <w:right w:val="single" w:color="E5E5E5" w:sz="4"/>
-            </w:tcBorders>
-            <w:tcMar>
-              <w:top w:type="dxa" w:w="70"/>
-              <w:left w:type="dxa" w:w="110"/>
-              <w:bottom w:type="dxa" w:w="70"/>
-              <w:right w:type="dxa" w:w="110"/>
-            </w:tcMar>
-          </w:tcPr>
-          <w:p>
-            <w:pPr>
-              <w:spacing w:after="0" w:line="270"/>
-            </w:pPr>
-            <w:r>
-              <w:rPr>
-                <w:rFonts w:ascii="Arial" w:cs="Arial" w:eastAsia="Arial" w:hAnsi="Arial"/>
-                <w:sz w:val="19"/>
-                <w:szCs w:val="19"/>
-              </w:rPr>
-              <w:t xml:space="preserve">Yearly support (after 6 months free bug-fixing)</w:t>
-            </w:r>
-          </w:p>
-        </w:tc>
-        <w:tc>
-          <w:tcPr>
-            <w:tcW w:type="dxa" w:w="3000"/>
-            <w:tcBorders>
-              <w:top w:val="single" w:color="E5E5E5" w:sz="4"/>
-              <w:left w:val="single" w:color="E5E5E5" w:sz="4"/>
-              <w:bottom w:val="single" w:color="E5E5E5" w:sz="4"/>
-              <w:right w:val="single" w:color="E5E5E5" w:sz="4"/>
-            </w:tcBorders>
-            <w:tcMar>
-              <w:top w:type="dxa" w:w="70"/>
-              <w:left w:type="dxa" w:w="110"/>
-              <w:bottom w:type="dxa" w:w="70"/>
-              <w:right w:type="dxa" w:w="110"/>
-            </w:tcMar>
-          </w:tcPr>
-          <w:p>
-            <w:pPr>
-              <w:spacing w:after="0" w:line="270"/>
-            </w:pPr>
-            <w:r>
-              <w:rPr>
-                <w:rFonts w:ascii="Arial" w:cs="Arial" w:eastAsia="Arial" w:hAnsi="Arial"/>
-                <w:sz w:val="19"/>
-                <w:szCs w:val="19"/>
-              </w:rPr>
-              <w:t xml:space="preserve">[to be filled]</w:t>
-            </w:r>
-          </w:p>
-        </w:tc>
-        <w:tc>
-          <w:tcPr>
-            <w:tcW w:type="dxa" w:w="3038"/>
-            <w:tcBorders>
-              <w:top w:val="single" w:color="E5E5E5" w:sz="4"/>
-              <w:left w:val="single" w:color="E5E5E5" w:sz="4"/>
-              <w:bottom w:val="single" w:color="E5E5E5" w:sz="4"/>
-              <w:right w:val="single" w:color="E5E5E5" w:sz="4"/>
-            </w:tcBorders>
-            <w:tcMar>
-              <w:top w:type="dxa" w:w="70"/>
-              <w:left w:type="dxa" w:w="110"/>
-              <w:bottom w:type="dxa" w:w="70"/>
-              <w:right w:type="dxa" w:w="110"/>
-            </w:tcMar>
-          </w:tcPr>
-          <w:p>
-            <w:pPr>
-              <w:spacing w:after="0" w:line="270"/>
-            </w:pPr>
-            <w:r>
-              <w:rPr>
-                <w:rFonts w:ascii="Arial" w:cs="Arial" w:eastAsia="Arial" w:hAnsi="Arial"/>
-                <w:sz w:val="19"/>
-                <w:szCs w:val="19"/>
-              </w:rPr>
-              <w:t xml:space="preserve">Quoted separately</w:t>
-            </w:r>
-          </w:p>
-        </w:tc>
-      </w:tr>
-      <w:tr>
-        <w:trPr>
-          <w:tblHeader w:val="off"/>
-        </w:trPr>
-        <w:tc>
-          <w:tcPr>
-            <w:tcW w:type="dxa" w:w="3600"/>
-            <w:tcBorders>
-              <w:top w:val="single" w:color="E5E5E5" w:sz="4"/>
-              <w:left w:val="single" w:color="E5E5E5" w:sz="4"/>
-              <w:bottom w:val="single" w:color="E5E5E5" w:sz="4"/>
-              <w:right w:val="single" w:color="E5E5E5" w:sz="4"/>
-            </w:tcBorders>
-            <w:tcMar>
-              <w:top w:type="dxa" w:w="70"/>
-              <w:left w:type="dxa" w:w="110"/>
-              <w:bottom w:type="dxa" w:w="70"/>
-              <w:right w:type="dxa" w:w="110"/>
-            </w:tcMar>
-          </w:tcPr>
-          <w:p>
-            <w:pPr>
-              <w:spacing w:after="0" w:line="270"/>
-            </w:pPr>
-            <w:r>
-              <w:rPr>
-                <w:rFonts w:ascii="Arial" w:cs="Arial" w:eastAsia="Arial" w:hAnsi="Arial"/>
-                <w:sz w:val="19"/>
-                <w:szCs w:val="19"/>
-              </w:rPr>
-              <w:t xml:space="preserve">Barcode / scale integration (later)</w:t>
-            </w:r>
-          </w:p>
-        </w:tc>
-        <w:tc>
-          <w:tcPr>
-            <w:tcW w:type="dxa" w:w="3000"/>
-            <w:tcBorders>
-              <w:top w:val="single" w:color="E5E5E5" w:sz="4"/>
-              <w:left w:val="single" w:color="E5E5E5" w:sz="4"/>
-              <w:bottom w:val="single" w:color="E5E5E5" w:sz="4"/>
-              <w:right w:val="single" w:color="E5E5E5" w:sz="4"/>
-            </w:tcBorders>
-            <w:tcMar>
-              <w:top w:type="dxa" w:w="70"/>
-              <w:left w:type="dxa" w:w="110"/>
-              <w:bottom w:type="dxa" w:w="70"/>
-              <w:right w:type="dxa" w:w="110"/>
-            </w:tcMar>
-          </w:tcPr>
-          <w:p>
-            <w:pPr>
-              <w:spacing w:after="0" w:line="270"/>
-            </w:pPr>
-            <w:r>
-              <w:rPr>
-                <w:rFonts w:ascii="Arial" w:cs="Arial" w:eastAsia="Arial" w:hAnsi="Arial"/>
-                <w:sz w:val="19"/>
-                <w:szCs w:val="19"/>
-              </w:rPr>
-              <w:t xml:space="preserve">[to be filled]</w:t>
-            </w:r>
-          </w:p>
-        </w:tc>
-        <w:tc>
-          <w:tcPr>
-            <w:tcW w:type="dxa" w:w="3038"/>
-            <w:tcBorders>
-              <w:top w:val="single" w:color="E5E5E5" w:sz="4"/>
-              <w:left w:val="single" w:color="E5E5E5" w:sz="4"/>
-              <w:bottom w:val="single" w:color="E5E5E5" w:sz="4"/>
-              <w:right w:val="single" w:color="E5E5E5" w:sz="4"/>
-            </w:tcBorders>
-            <w:tcMar>
-              <w:top w:type="dxa" w:w="70"/>
-              <w:left w:type="dxa" w:w="110"/>
-              <w:bottom w:type="dxa" w:w="70"/>
-              <w:right w:type="dxa" w:w="110"/>
-            </w:tcMar>
-          </w:tcPr>
-          <w:p>
-            <w:pPr>
-              <w:spacing w:after="0" w:line="270"/>
-            </w:pPr>
-            <w:r>
-              <w:rPr>
-                <w:rFonts w:ascii="Arial" w:cs="Arial" w:eastAsia="Arial" w:hAnsi="Arial"/>
-                <w:sz w:val="19"/>
-                <w:szCs w:val="19"/>
-              </w:rPr>
-              <w:t xml:space="preserve">Software only; hardware bought by you</w:t>
-            </w:r>
-          </w:p>
-        </w:tc>
-      </w:tr>
-    </w:tbl>
-    <w:p>
-      <w:pPr>
-        <w:spacing w:after="120"/>
-      </w:pPr>
-    </w:p>
-    <w:p>
-      <w:pPr>
-        <w:spacing w:after="120" w:line="300"/>
-      </w:pPr>
-      <w:r>
-        <w:rPr>
-          <w:rFonts w:ascii="Arial" w:cs="Arial" w:eastAsia="Arial" w:hAnsi="Arial"/>
-        </w:rPr>
-        <w:t xml:space="preserve">Payment terms (as per your brief): 10% on signing; the balance split across milestones on acceptance; 10% retained until 30 days after go-live.</w:t>
-      </w:r>
-    </w:p>
-    <w:p>
-      <w:pPr>
-        <w:spacing w:after="120" w:line="300"/>
-      </w:pPr>
-      <w:r>
-        <w:rPr>
-          <w:rFonts w:ascii="Arial" w:cs="Arial" w:eastAsia="Arial" w:hAnsi="Arial"/>
-        </w:rPr>
-        <w:t xml:space="preserve">Included: setup guide, data dictionary, user guides in English, Hindi and Tamil with each milestone; 6 months of bug-fixing after go-live.</w:t>
-      </w:r>
-    </w:p>
-    <w:p>
-      <w:pPr>
-        <w:spacing w:after="120" w:line="300"/>
-      </w:pPr>
-      <w:r>
-        <w:rPr>
-          <w:rFonts w:ascii="Arial" w:cs="Arial" w:eastAsia="Arial" w:hAnsi="Arial"/>
-        </w:rPr>
-        <w:t xml:space="preserve">Not included in Phase 1: payroll/attendance, accounts/billing, hardware supply, AI features — quoted separately when needed.</w:t>
-      </w:r>
-    </w:p>
-    <w:p>
-      <w:pPr>
-        <w:pStyle w:val="Heading1"/>
-      </w:pPr>
-      <w:r>
-        <w:rPr>
-          <w:rFonts w:ascii="Arial" w:cs="Arial" w:eastAsia="Arial" w:hAnsi="Arial"/>
-        </w:rPr>
-        <w:t xml:space="preserve">11. Team and references</w:t>
-      </w:r>
-    </w:p>
-    <w:tbl>
-      <w:tblPr>
-        <w:tblW w:type="dxa" w:w="9638"/>
-        <w:tblBorders>
-          <w:top w:val="single" w:color="auto" w:sz="4"/>
-          <w:left w:val="single" w:color="auto" w:sz="4"/>
-          <w:bottom w:val="single" w:color="auto" w:sz="4"/>
-          <w:right w:val="single" w:color="auto" w:sz="4"/>
-          <w:insideH w:val="single" w:color="auto" w:sz="4"/>
-          <w:insideV w:val="single" w:color="auto" w:sz="4"/>
-        </w:tblBorders>
-      </w:tblPr>
-      <w:tblGrid>
-        <w:gridCol w:w="3000"/>
-        <w:gridCol w:w="6638"/>
-      </w:tblGrid>
-      <w:tr>
-        <w:trPr>
-          <w:tblHeader w:val="off"/>
-        </w:trPr>
-        <w:tc>
-          <w:tcPr>
-            <w:tcW w:type="dxa" w:w="3000"/>
-            <w:tcBorders>
-              <w:top w:val="single" w:color="E5E5E5" w:sz="4"/>
-              <w:left w:val="single" w:color="E5E5E5" w:sz="4"/>
-              <w:bottom w:val="single" w:color="E5E5E5" w:sz="4"/>
-              <w:right w:val="single" w:color="E5E5E5" w:sz="4"/>
-            </w:tcBorders>
-            <w:tcMar>
-              <w:top w:type="dxa" w:w="70"/>
-              <w:left w:type="dxa" w:w="110"/>
-              <w:bottom w:type="dxa" w:w="70"/>
-              <w:right w:type="dxa" w:w="110"/>
-            </w:tcMar>
-          </w:tcPr>
-          <w:p>
-            <w:pPr>
-              <w:spacing w:after="0" w:line="270"/>
-            </w:pPr>
-            <w:r>
-              <w:rPr>
-                <w:rFonts w:ascii="Arial" w:cs="Arial" w:eastAsia="Arial" w:hAnsi="Arial"/>
-                <w:sz w:val="19"/>
-                <w:szCs w:val="19"/>
-              </w:rPr>
-              <w:t xml:space="preserve"/>
-            </w:r>
-          </w:p>
-        </w:tc>
-        <w:tc>
-          <w:tcPr>
-            <w:tcW w:type="dxa" w:w="6638"/>
-            <w:tcBorders>
-              <w:top w:val="single" w:color="E5E5E5" w:sz="4"/>
-              <w:left w:val="single" w:color="E5E5E5" w:sz="4"/>
-              <w:bottom w:val="single" w:color="E5E5E5" w:sz="4"/>
-              <w:right w:val="single" w:color="E5E5E5" w:sz="4"/>
-            </w:tcBorders>
-            <w:tcMar>
-              <w:top w:type="dxa" w:w="70"/>
-              <w:left w:type="dxa" w:w="110"/>
-              <w:bottom w:type="dxa" w:w="70"/>
-              <w:right w:type="dxa" w:w="110"/>
-            </w:tcMar>
-          </w:tcPr>
-          <w:p>
-            <w:pPr>
-              <w:spacing w:after="0" w:line="270"/>
-            </w:pPr>
-            <w:r>
-              <w:rPr>
-                <w:rFonts w:ascii="Arial" w:cs="Arial" w:eastAsia="Arial" w:hAnsi="Arial"/>
-                <w:sz w:val="19"/>
-                <w:szCs w:val="19"/>
-              </w:rPr>
-              <w:t xml:space="preserve"/>
-            </w:r>
-          </w:p>
-        </w:tc>
-      </w:tr>
-      <w:tr>
-        <w:trPr>
-          <w:tblHeader w:val="off"/>
-        </w:trPr>
-        <w:tc>
-          <w:tcPr>
-            <w:tcW w:type="dxa" w:w="3000"/>
-            <w:tcBorders>
-              <w:top w:val="single" w:color="E5E5E5" w:sz="4"/>
-              <w:left w:val="single" w:color="E5E5E5" w:sz="4"/>
-              <w:bottom w:val="single" w:color="E5E5E5" w:sz="4"/>
-              <w:right w:val="single" w:color="E5E5E5" w:sz="4"/>
-            </w:tcBorders>
-            <w:tcMar>
-              <w:top w:type="dxa" w:w="70"/>
-              <w:left w:type="dxa" w:w="110"/>
-              <w:bottom w:type="dxa" w:w="70"/>
-              <w:right w:type="dxa" w:w="110"/>
-            </w:tcMar>
-          </w:tcPr>
-          <w:p>
-            <w:pPr>
-              <w:spacing w:after="0" w:line="270"/>
-            </w:pPr>
-            <w:r>
-              <w:rPr>
-                <w:rFonts w:ascii="Arial" w:cs="Arial" w:eastAsia="Arial" w:hAnsi="Arial"/>
-                <w:sz w:val="19"/>
-                <w:szCs w:val="19"/>
-              </w:rPr>
-              <w:t xml:space="preserve">Lead developer</w:t>
-            </w:r>
-          </w:p>
-        </w:tc>
-        <w:tc>
-          <w:tcPr>
-            <w:tcW w:type="dxa" w:w="6638"/>
-            <w:tcBorders>
-              <w:top w:val="single" w:color="E5E5E5" w:sz="4"/>
-              <w:left w:val="single" w:color="E5E5E5" w:sz="4"/>
-              <w:bottom w:val="single" w:color="E5E5E5" w:sz="4"/>
-              <w:right w:val="single" w:color="E5E5E5" w:sz="4"/>
-            </w:tcBorders>
-            <w:tcMar>
-              <w:top w:type="dxa" w:w="70"/>
-              <w:left w:type="dxa" w:w="110"/>
-              <w:bottom w:type="dxa" w:w="70"/>
-              <w:right w:type="dxa" w:w="110"/>
-            </w:tcMar>
-          </w:tcPr>
-          <w:p>
-            <w:pPr>
-              <w:spacing w:after="0" w:line="270"/>
-            </w:pPr>
-            <w:r>
-              <w:rPr>
-                <w:rFonts w:ascii="Arial" w:cs="Arial" w:eastAsia="Arial" w:hAnsi="Arial"/>
-                <w:sz w:val="19"/>
-                <w:szCs w:val="19"/>
-              </w:rPr>
-              <w:t xml:space="preserve">[name] — builds Milestone 1</w:t>
-            </w:r>
-          </w:p>
-        </w:tc>
-      </w:tr>
-      <w:tr>
-        <w:trPr>
-          <w:tblHeader w:val="off"/>
-        </w:trPr>
-        <w:tc>
-          <w:tcPr>
-            <w:tcW w:type="dxa" w:w="3000"/>
-            <w:tcBorders>
-              <w:top w:val="single" w:color="E5E5E5" w:sz="4"/>
-              <w:left w:val="single" w:color="E5E5E5" w:sz="4"/>
-              <w:bottom w:val="single" w:color="E5E5E5" w:sz="4"/>
-              <w:right w:val="single" w:color="E5E5E5" w:sz="4"/>
-            </w:tcBorders>
-            <w:tcMar>
-              <w:top w:type="dxa" w:w="70"/>
-              <w:left w:type="dxa" w:w="110"/>
-              <w:bottom w:type="dxa" w:w="70"/>
-              <w:right w:type="dxa" w:w="110"/>
-            </w:tcMar>
-          </w:tcPr>
-          <w:p>
-            <w:pPr>
-              <w:spacing w:after="0" w:line="270"/>
-            </w:pPr>
-            <w:r>
-              <w:rPr>
-                <w:rFonts w:ascii="Arial" w:cs="Arial" w:eastAsia="Arial" w:hAnsi="Arial"/>
-                <w:sz w:val="19"/>
-                <w:szCs w:val="19"/>
-              </w:rPr>
-              <w:t xml:space="preserve">Sudo Sapient</w:t>
-            </w:r>
-          </w:p>
-        </w:tc>
-        <w:tc>
-          <w:tcPr>
-            <w:tcW w:type="dxa" w:w="6638"/>
-            <w:tcBorders>
-              <w:top w:val="single" w:color="E5E5E5" w:sz="4"/>
-              <w:left w:val="single" w:color="E5E5E5" w:sz="4"/>
-              <w:bottom w:val="single" w:color="E5E5E5" w:sz="4"/>
-              <w:right w:val="single" w:color="E5E5E5" w:sz="4"/>
-            </w:tcBorders>
-            <w:tcMar>
-              <w:top w:type="dxa" w:w="70"/>
-              <w:left w:type="dxa" w:w="110"/>
-              <w:bottom w:type="dxa" w:w="70"/>
-              <w:right w:type="dxa" w:w="110"/>
-            </w:tcMar>
-          </w:tcPr>
-          <w:p>
-            <w:pPr>
-              <w:spacing w:after="0" w:line="270"/>
-            </w:pPr>
-            <w:r>
-              <w:rPr>
-                <w:rFonts w:ascii="Arial" w:cs="Arial" w:eastAsia="Arial" w:hAnsi="Arial"/>
-                <w:sz w:val="19"/>
-                <w:szCs w:val="19"/>
-              </w:rPr>
-              <w:t xml:space="preserve">Sabari K — joins for Milestones 2–4; your single point of contact</w:t>
-            </w:r>
-          </w:p>
-        </w:tc>
-      </w:tr>
-      <w:tr>
-        <w:trPr>
-          <w:tblHeader w:val="off"/>
-        </w:trPr>
-        <w:tc>
-          <w:tcPr>
-            <w:tcW w:type="dxa" w:w="3000"/>
-            <w:tcBorders>
-              <w:top w:val="single" w:color="E5E5E5" w:sz="4"/>
-              <w:left w:val="single" w:color="E5E5E5" w:sz="4"/>
-              <w:bottom w:val="single" w:color="E5E5E5" w:sz="4"/>
-              <w:right w:val="single" w:color="E5E5E5" w:sz="4"/>
-            </w:tcBorders>
-            <w:tcMar>
-              <w:top w:type="dxa" w:w="70"/>
-              <w:left w:type="dxa" w:w="110"/>
-              <w:bottom w:type="dxa" w:w="70"/>
-              <w:right w:type="dxa" w:w="110"/>
-            </w:tcMar>
-          </w:tcPr>
-          <w:p>
-            <w:pPr>
-              <w:spacing w:after="0" w:line="270"/>
-            </w:pPr>
-            <w:r>
-              <w:rPr>
-                <w:rFonts w:ascii="Arial" w:cs="Arial" w:eastAsia="Arial" w:hAnsi="Arial"/>
-                <w:sz w:val="19"/>
-                <w:szCs w:val="19"/>
-              </w:rPr>
-              <w:t xml:space="preserve">Time per week</w:t>
-            </w:r>
-          </w:p>
-        </w:tc>
-        <w:tc>
-          <w:tcPr>
-            <w:tcW w:type="dxa" w:w="6638"/>
-            <w:tcBorders>
-              <w:top w:val="single" w:color="E5E5E5" w:sz="4"/>
-              <w:left w:val="single" w:color="E5E5E5" w:sz="4"/>
-              <w:bottom w:val="single" w:color="E5E5E5" w:sz="4"/>
-              <w:right w:val="single" w:color="E5E5E5" w:sz="4"/>
-            </w:tcBorders>
-            <w:tcMar>
-              <w:top w:type="dxa" w:w="70"/>
-              <w:left w:type="dxa" w:w="110"/>
-              <w:bottom w:type="dxa" w:w="70"/>
-              <w:right w:type="dxa" w:w="110"/>
-            </w:tcMar>
-          </w:tcPr>
-          <w:p>
-            <w:pPr>
-              <w:spacing w:after="0" w:line="270"/>
-            </w:pPr>
-            <w:r>
-              <w:rPr>
-                <w:rFonts w:ascii="Arial" w:cs="Arial" w:eastAsia="Arial" w:hAnsi="Arial"/>
-                <w:sz w:val="19"/>
-                <w:szCs w:val="19"/>
-              </w:rPr>
-              <w:t xml:space="preserve">[to be filled]</w:t>
-            </w:r>
-          </w:p>
-        </w:tc>
-      </w:tr>
-      <w:tr>
-        <w:trPr>
-          <w:tblHeader w:val="off"/>
-        </w:trPr>
-        <w:tc>
-          <w:tcPr>
-            <w:tcW w:type="dxa" w:w="3000"/>
-            <w:tcBorders>
-              <w:top w:val="single" w:color="E5E5E5" w:sz="4"/>
-              <w:left w:val="single" w:color="E5E5E5" w:sz="4"/>
-              <w:bottom w:val="single" w:color="E5E5E5" w:sz="4"/>
-              <w:right w:val="single" w:color="E5E5E5" w:sz="4"/>
-            </w:tcBorders>
-            <w:tcMar>
-              <w:top w:type="dxa" w:w="70"/>
-              <w:left w:type="dxa" w:w="110"/>
-              <w:bottom w:type="dxa" w:w="70"/>
-              <w:right w:type="dxa" w:w="110"/>
-            </w:tcMar>
-          </w:tcPr>
-          <w:p>
-            <w:pPr>
-              <w:spacing w:after="0" w:line="270"/>
-            </w:pPr>
-            <w:r>
-              <w:rPr>
-                <w:rFonts w:ascii="Arial" w:cs="Arial" w:eastAsia="Arial" w:hAnsi="Arial"/>
-                <w:sz w:val="19"/>
-                <w:szCs w:val="19"/>
-              </w:rPr>
-              <w:t xml:space="preserve">Similar systems built</w:t>
-            </w:r>
-          </w:p>
-        </w:tc>
-        <w:tc>
-          <w:tcPr>
-            <w:tcW w:type="dxa" w:w="6638"/>
-            <w:tcBorders>
-              <w:top w:val="single" w:color="E5E5E5" w:sz="4"/>
-              <w:left w:val="single" w:color="E5E5E5" w:sz="4"/>
-              <w:bottom w:val="single" w:color="E5E5E5" w:sz="4"/>
-              <w:right w:val="single" w:color="E5E5E5" w:sz="4"/>
-            </w:tcBorders>
-            <w:tcMar>
-              <w:top w:type="dxa" w:w="70"/>
-              <w:left w:type="dxa" w:w="110"/>
-              <w:bottom w:type="dxa" w:w="70"/>
-              <w:right w:type="dxa" w:w="110"/>
-            </w:tcMar>
-          </w:tcPr>
-          <w:p>
-            <w:pPr>
-              <w:spacing w:after="0" w:line="270"/>
-            </w:pPr>
-            <w:r>
-              <w:rPr>
-                <w:rFonts w:ascii="Arial" w:cs="Arial" w:eastAsia="Arial" w:hAnsi="Arial"/>
-                <w:sz w:val="19"/>
-                <w:szCs w:val="19"/>
-              </w:rPr>
-              <w:t xml:space="preserve">[to be filled]</w:t>
-            </w:r>
-          </w:p>
-        </w:tc>
-      </w:tr>
-      <w:tr>
-        <w:trPr>
-          <w:tblHeader w:val="off"/>
-        </w:trPr>
-        <w:tc>
-          <w:tcPr>
-            <w:tcW w:type="dxa" w:w="3000"/>
-            <w:tcBorders>
-              <w:top w:val="single" w:color="E5E5E5" w:sz="4"/>
-              <w:left w:val="single" w:color="E5E5E5" w:sz="4"/>
-              <w:bottom w:val="single" w:color="E5E5E5" w:sz="4"/>
-              <w:right w:val="single" w:color="E5E5E5" w:sz="4"/>
-            </w:tcBorders>
-            <w:tcMar>
-              <w:top w:type="dxa" w:w="70"/>
-              <w:left w:type="dxa" w:w="110"/>
-              <w:bottom w:type="dxa" w:w="70"/>
-              <w:right w:type="dxa" w:w="110"/>
-            </w:tcMar>
-          </w:tcPr>
-          <w:p>
-            <w:pPr>
-              <w:spacing w:after="0" w:line="270"/>
-            </w:pPr>
-            <w:r>
-              <w:rPr>
-                <w:rFonts w:ascii="Arial" w:cs="Arial" w:eastAsia="Arial" w:hAnsi="Arial"/>
-                <w:sz w:val="19"/>
-                <w:szCs w:val="19"/>
-              </w:rPr>
-              <w:t xml:space="preserve">Reference you can call</w:t>
-            </w:r>
-          </w:p>
-        </w:tc>
-        <w:tc>
-          <w:tcPr>
-            <w:tcW w:type="dxa" w:w="6638"/>
-            <w:tcBorders>
-              <w:top w:val="single" w:color="E5E5E5" w:sz="4"/>
-              <w:left w:val="single" w:color="E5E5E5" w:sz="4"/>
-              <w:bottom w:val="single" w:color="E5E5E5" w:sz="4"/>
-              <w:right w:val="single" w:color="E5E5E5" w:sz="4"/>
-            </w:tcBorders>
-            <w:tcMar>
-              <w:top w:type="dxa" w:w="70"/>
-              <w:left w:type="dxa" w:w="110"/>
-              <w:bottom w:type="dxa" w:w="70"/>
-              <w:right w:type="dxa" w:w="110"/>
-            </w:tcMar>
-          </w:tcPr>
-          <w:p>
-            <w:pPr>
-              <w:spacing w:after="0" w:line="270"/>
-            </w:pPr>
-            <w:r>
-              <w:rPr>
-                <w:rFonts w:ascii="Arial" w:cs="Arial" w:eastAsia="Arial" w:hAnsi="Arial"/>
-                <w:sz w:val="19"/>
-                <w:szCs w:val="19"/>
-              </w:rPr>
-              <w:t xml:space="preserve">[to be filled]</w:t>
-            </w:r>
-          </w:p>
-        </w:tc>
-      </w:tr>
-    </w:tbl>
-    <w:p>
-      <w:pPr>
-        <w:pStyle w:val="Heading1"/>
-      </w:pPr>
-      <w:r>
-        <w:rPr>
-          <w:rFonts w:ascii="Arial" w:cs="Arial" w:eastAsia="Arial" w:hAnsi="Arial"/>
-        </w:rPr>
-        <w:t xml:space="preserve">12. Next steps</w:t>
+        <w:t xml:space="preserve">10. Next steps</w:t>
       </w:r>
     </w:p>
     <w:p>
@@ -6726,23 +5430,7 @@
         <w:rPr>
           <w:rFonts w:ascii="Arial" w:cs="Arial" w:eastAsia="Arial" w:hAnsi="Arial"/>
         </w:rPr>
-        <w:t xml:space="preserve">We send the fixed price per milestone and the trial plan with written acceptance criteria.</w:t>
-      </w:r>
-    </w:p>
-    <w:p>
-      <w:pPr>
-        <w:pStyle w:val="ListParagraph"/>
-        <w:numPr>
-          <w:ilvl w:val="0"/>
-          <w:numId w:val="3"/>
-        </w:numPr>
-        <w:spacing w:after="80" w:line="290"/>
-      </w:pPr>
-      <w:r>
-        <w:rPr>
-          <w:rFonts w:ascii="Arial" w:cs="Arial" w:eastAsia="Arial" w:hAnsi="Arial"/>
-        </w:rPr>
-        <w:t xml:space="preserve">Sign, 10% advance, Milestone 1 starts on your server and Git account.</w:t>
+        <w:t xml:space="preserve">We send the trial plan with written acceptance criteria, and Milestone 1 starts on your server and Git account.</w:t>
       </w:r>
     </w:p>
     <w:sectPr>

</xml_diff>